<commit_message>
Fechas por commit de Git en ACTIVIDADES y BITACORA
</commit_message>
<xml_diff>
--- a/ACTIVIDADES/DIA-10.docx
+++ b/ACTIVIDADES/DIA-10.docx
@@ -487,10 +487,7 @@
               <w:rPr/>
             </w:pPr>
             <w:r>
-              <w:rPr>
-                <w:rtl w:val="0"/>
-              </w:rPr>
-              <w:t xml:space="preserve">21 de septiembre de 2026</w:t>
+              <w:t>21 de septiembre de 2026</w:t>
             </w:r>
           </w:p>
         </w:tc>

</xml_diff>